<commit_message>
Diseño inicial de la solución del desafío
</commit_message>
<xml_diff>
--- a/Analisis_Primer_Desafio.docx
+++ b/Analisis_Primer_Desafio.docx
@@ -4074,9 +4074,152 @@
     <w:p>
       <w:pPr>
         <w:rPr>
+          <w:u w:val="single"/>
           <w:lang w:val="es-MX"/>
         </w:rPr>
       </w:pPr>
+      <w:r>
+        <w:rPr>
+          <w:u w:val="single"/>
+          <w:lang w:val="es-MX"/>
+        </w:rPr>
+        <w:t>DISEÑO DE LA SOLUCIÓN:</w:t>
+      </w:r>
+    </w:p>
+    <w:p>
+      <w:pPr>
+        <w:rPr>
+          <w:lang w:val="es-MX"/>
+        </w:rPr>
+      </w:pPr>
+      <w:r>
+        <w:rPr>
+          <w:lang w:val="es-MX"/>
+        </w:rPr>
+        <w:t>Mi idea inicial de la solución sería un documento .</w:t>
+      </w:r>
+      <w:proofErr w:type="spellStart"/>
+      <w:r>
+        <w:rPr>
+          <w:lang w:val="es-MX"/>
+        </w:rPr>
+        <w:t>cpp</w:t>
+      </w:r>
+      <w:proofErr w:type="spellEnd"/>
+      <w:r>
+        <w:rPr>
+          <w:lang w:val="es-MX"/>
+        </w:rPr>
+        <w:t xml:space="preserve"> con todas las funciones y el </w:t>
+      </w:r>
+      <w:proofErr w:type="spellStart"/>
+      <w:r>
+        <w:rPr>
+          <w:lang w:val="es-MX"/>
+        </w:rPr>
+        <w:t>main,cpp</w:t>
+      </w:r>
+      <w:proofErr w:type="spellEnd"/>
+      <w:r>
+        <w:rPr>
+          <w:lang w:val="es-MX"/>
+        </w:rPr>
+        <w:t xml:space="preserve"> que sea donde se ejecute el programa, ahora bien, en el </w:t>
+      </w:r>
+      <w:proofErr w:type="spellStart"/>
+      <w:r>
+        <w:rPr>
+          <w:lang w:val="es-MX"/>
+        </w:rPr>
+        <w:t>main</w:t>
+      </w:r>
+      <w:proofErr w:type="spellEnd"/>
+      <w:r>
+        <w:rPr>
+          <w:lang w:val="es-MX"/>
+        </w:rPr>
+        <w:t xml:space="preserve"> sería solo la ejecución del juego, la idea es tener un </w:t>
+      </w:r>
+      <w:proofErr w:type="spellStart"/>
+      <w:r>
+        <w:rPr>
+          <w:lang w:val="es-MX"/>
+        </w:rPr>
+        <w:t>main</w:t>
+      </w:r>
+      <w:proofErr w:type="spellEnd"/>
+      <w:r>
+        <w:rPr>
+          <w:lang w:val="es-MX"/>
+        </w:rPr>
+        <w:t xml:space="preserve"> limpio, por lo que el documento de funciones tendría varias cosas, en este documento estarán diferentes funciones, que aún no tengo totalmente definidas, pero tengo idea de algunas:</w:t>
+      </w:r>
+    </w:p>
+    <w:p>
+      <w:pPr>
+        <w:rPr>
+          <w:lang w:val="es-MX"/>
+        </w:rPr>
+      </w:pPr>
+      <w:r>
+        <w:rPr>
+          <w:lang w:val="es-MX"/>
+        </w:rPr>
+        <w:t>Una función para crear el tablero, como el tablero no tiene las dimensiones predefinidas, entonces se debe tener una función que permita crear y asigne el tipo de dato que se usara para almacenar las filas que compondrán el tablero según lo que solicite el usuario.</w:t>
+      </w:r>
+    </w:p>
+    <w:p>
+      <w:pPr>
+        <w:rPr>
+          <w:lang w:val="es-MX"/>
+        </w:rPr>
+      </w:pPr>
+      <w:r>
+        <w:rPr>
+          <w:lang w:val="es-MX"/>
+        </w:rPr>
+        <w:t>Una vez teniendo el tablero, podemos pensar en generar las piezas, debe ser una función que genere la representación de cada pieza aleatoriamente, creo que es una de las funciones principales, ya que es lo que alimentara el juego en cada turno.</w:t>
+      </w:r>
+    </w:p>
+    <w:p>
+      <w:pPr>
+        <w:rPr>
+          <w:lang w:val="es-MX"/>
+        </w:rPr>
+      </w:pPr>
+      <w:r>
+        <w:rPr>
+          <w:lang w:val="es-MX"/>
+        </w:rPr>
+        <w:t>Ahora bien, teniendo el tablero y una función que genere las fichas, necesitamos funciones que jueguen con los bits, es decir, que roten, que mueva a la derecha a la izquierda para que el usuario pueda mover las fichas e ir llenando el tablero, las funciones de rotar, mover izquierda, mover a la derecha no son aleatorias, solo se ejecutaran con un comando especial que proporcione el usuario, por ejemplo, mover a la derecha puede ser cuando el usuario presione la tecla “D”.</w:t>
+      </w:r>
+    </w:p>
+    <w:p>
+      <w:pPr>
+        <w:rPr>
+          <w:lang w:val="es-MX"/>
+        </w:rPr>
+      </w:pPr>
+      <w:r>
+        <w:rPr>
+          <w:lang w:val="es-MX"/>
+        </w:rPr>
+        <w:t>Con todo lo anterior ya tendríamos un usuario moviendo fichas en un tablero que genera aleatoriamente estas mismas, ahora se debe pensar en la reacción del juego con los movimientos que ejecuta el usuario, es aquí donde entra las funciones para detectar colisiones y para eliminar filas, la función de las colisiones se encargara básicamente de dejar mover las fichas si es posible o detenerlas si encuentra algún bit ocupado y finalmente la eliminación de filas es la que se encarga de verificar cuando la fila esta llena, de bajar la fila de arriba y se colocar una fila vacía en la parte superior del tablero.</w:t>
+      </w:r>
+    </w:p>
+    <w:p>
+      <w:pPr>
+        <w:rPr>
+          <w:lang w:val="es-MX"/>
+        </w:rPr>
+      </w:pPr>
+      <w:r>
+        <w:rPr>
+          <w:lang w:val="es-MX"/>
+        </w:rPr>
+        <w:lastRenderedPageBreak/>
+        <w:t>Creo que con todo lo anterior ya tendríamos un diseño de la solución con las funciones principales para cumplir satisfactoriamente con el desafío, soy consciente que pueden necesitarse más funciones, pero la idea general es resuelta con las anteriormente mencionadas.</w:t>
+      </w:r>
     </w:p>
     <w:p>
       <w:pPr>

</xml_diff>

<commit_message>
Flujo basico del juego
</commit_message>
<xml_diff>
--- a/Analisis_Primer_Desafio.docx
+++ b/Analisis_Primer_Desafio.docx
@@ -91,49 +91,7 @@
         <w:rPr>
           <w:lang w:val="es-MX"/>
         </w:rPr>
-        <w:t xml:space="preserve"> si el ancho del tablero es de 8 bits, se podría almacenar usando una variable de tipo </w:t>
-      </w:r>
-      <w:proofErr w:type="spellStart"/>
-      <w:r>
-        <w:rPr>
-          <w:lang w:val="es-MX"/>
-        </w:rPr>
-        <w:t>unsigned</w:t>
-      </w:r>
-      <w:proofErr w:type="spellEnd"/>
-      <w:r>
-        <w:rPr>
-          <w:lang w:val="es-MX"/>
-        </w:rPr>
-        <w:t xml:space="preserve"> </w:t>
-      </w:r>
-      <w:proofErr w:type="spellStart"/>
-      <w:r>
-        <w:rPr>
-          <w:lang w:val="es-MX"/>
-        </w:rPr>
-        <w:t>char</w:t>
-      </w:r>
-      <w:proofErr w:type="spellEnd"/>
-      <w:r>
-        <w:rPr>
-          <w:lang w:val="es-MX"/>
-        </w:rPr>
-        <w:t xml:space="preserve">. Si el tablero mide 16 bits, entonces ya no sería suficiente ese tipo de variable y se podría usar uno más grande, como </w:t>
-      </w:r>
-      <w:proofErr w:type="spellStart"/>
-      <w:r>
-        <w:rPr>
-          <w:lang w:val="es-MX"/>
-        </w:rPr>
-        <w:t>unsigned</w:t>
-      </w:r>
-      <w:proofErr w:type="spellEnd"/>
-      <w:r>
-        <w:rPr>
-          <w:lang w:val="es-MX"/>
-        </w:rPr>
-        <w:t xml:space="preserve"> short. Esto se puede ver como una ventaja, ya que dependiendo del tamaño del tablero se puede elegir un tipo de dato que permita manejar la memoria de una forma más eficiente.</w:t>
+        <w:t xml:space="preserve"> si el ancho del tablero es de 8 bits, se podría almacenar usando una variable de tipo unsigned char. Si el tablero mide 16 bits, entonces ya no sería suficiente ese tipo de variable y se podría usar uno más grande, como unsigned short. Esto se puede ver como una ventaja, ya que dependiendo del tamaño del tablero se puede elegir un tipo de dato que permita manejar la memoria de una forma más eficiente.</w:t>
       </w:r>
     </w:p>
     <w:p>
@@ -4096,63 +4054,7 @@
         <w:rPr>
           <w:lang w:val="es-MX"/>
         </w:rPr>
-        <w:t>Mi idea inicial de la solución sería un documento .</w:t>
-      </w:r>
-      <w:proofErr w:type="spellStart"/>
-      <w:r>
-        <w:rPr>
-          <w:lang w:val="es-MX"/>
-        </w:rPr>
-        <w:t>cpp</w:t>
-      </w:r>
-      <w:proofErr w:type="spellEnd"/>
-      <w:r>
-        <w:rPr>
-          <w:lang w:val="es-MX"/>
-        </w:rPr>
-        <w:t xml:space="preserve"> con todas las funciones y el </w:t>
-      </w:r>
-      <w:proofErr w:type="spellStart"/>
-      <w:r>
-        <w:rPr>
-          <w:lang w:val="es-MX"/>
-        </w:rPr>
-        <w:t>main,cpp</w:t>
-      </w:r>
-      <w:proofErr w:type="spellEnd"/>
-      <w:r>
-        <w:rPr>
-          <w:lang w:val="es-MX"/>
-        </w:rPr>
-        <w:t xml:space="preserve"> que sea donde se ejecute el programa, ahora bien, en el </w:t>
-      </w:r>
-      <w:proofErr w:type="spellStart"/>
-      <w:r>
-        <w:rPr>
-          <w:lang w:val="es-MX"/>
-        </w:rPr>
-        <w:t>main</w:t>
-      </w:r>
-      <w:proofErr w:type="spellEnd"/>
-      <w:r>
-        <w:rPr>
-          <w:lang w:val="es-MX"/>
-        </w:rPr>
-        <w:t xml:space="preserve"> sería solo la ejecución del juego, la idea es tener un </w:t>
-      </w:r>
-      <w:proofErr w:type="spellStart"/>
-      <w:r>
-        <w:rPr>
-          <w:lang w:val="es-MX"/>
-        </w:rPr>
-        <w:t>main</w:t>
-      </w:r>
-      <w:proofErr w:type="spellEnd"/>
-      <w:r>
-        <w:rPr>
-          <w:lang w:val="es-MX"/>
-        </w:rPr>
-        <w:t xml:space="preserve"> limpio, por lo que el documento de funciones tendría varias cosas, en este documento estarán diferentes funciones, que aún no tengo totalmente definidas, pero tengo idea de algunas:</w:t>
+        <w:t>Mi idea inicial de la solución sería un documento .cpp con todas las funciones y el main,cpp que sea donde se ejecute el programa, ahora bien, en el main sería solo la ejecución del juego, la idea es tener un main limpio, por lo que el documento de funciones tendría varias cosas, en este documento estarán diferentes funciones, que aún no tengo totalmente definidas, pero tengo idea de algunas:</w:t>
       </w:r>
     </w:p>
     <w:p>
@@ -4224,9 +4126,312 @@
     <w:p>
       <w:pPr>
         <w:rPr>
+          <w:u w:val="single"/>
           <w:lang w:val="es-MX"/>
         </w:rPr>
       </w:pPr>
+      <w:r>
+        <w:rPr>
+          <w:u w:val="single"/>
+          <w:lang w:val="es-MX"/>
+        </w:rPr>
+        <w:t>FLUJO DEL JUEGO</w:t>
+      </w:r>
+      <w:r>
+        <w:rPr>
+          <w:u w:val="single"/>
+          <w:lang w:val="es-MX"/>
+        </w:rPr>
+        <w:t>:</w:t>
+      </w:r>
+    </w:p>
+    <w:p>
+      <w:pPr>
+        <w:pStyle w:val="Prrafodelista"/>
+        <w:numPr>
+          <w:ilvl w:val="0"/>
+          <w:numId w:val="2"/>
+        </w:numPr>
+        <w:rPr>
+          <w:lang w:val="es-MX"/>
+        </w:rPr>
+      </w:pPr>
+      <w:r>
+        <w:rPr>
+          <w:lang w:val="es-MX"/>
+        </w:rPr>
+        <w:t>I</w:t>
+      </w:r>
+      <w:r>
+        <w:rPr>
+          <w:lang w:val="es-MX"/>
+        </w:rPr>
+        <w:t>niciar juego</w:t>
+      </w:r>
+    </w:p>
+    <w:p>
+      <w:pPr>
+        <w:pStyle w:val="Prrafodelista"/>
+        <w:numPr>
+          <w:ilvl w:val="0"/>
+          <w:numId w:val="2"/>
+        </w:numPr>
+        <w:rPr>
+          <w:lang w:val="es-MX"/>
+        </w:rPr>
+      </w:pPr>
+      <w:r>
+        <w:rPr>
+          <w:lang w:val="es-MX"/>
+        </w:rPr>
+        <w:t>C</w:t>
+      </w:r>
+      <w:r>
+        <w:rPr>
+          <w:lang w:val="es-MX"/>
+        </w:rPr>
+        <w:t>rear tablero</w:t>
+      </w:r>
+      <w:r>
+        <w:rPr>
+          <w:lang w:val="es-MX"/>
+        </w:rPr>
+        <w:t xml:space="preserve"> según las dimensiones dadas por el usuario.</w:t>
+      </w:r>
+    </w:p>
+    <w:p>
+      <w:pPr>
+        <w:pStyle w:val="Prrafodelista"/>
+        <w:numPr>
+          <w:ilvl w:val="0"/>
+          <w:numId w:val="2"/>
+        </w:numPr>
+        <w:rPr>
+          <w:lang w:val="es-MX"/>
+        </w:rPr>
+      </w:pPr>
+      <w:r>
+        <w:rPr>
+          <w:lang w:val="es-MX"/>
+        </w:rPr>
+        <w:t>G</w:t>
+      </w:r>
+      <w:r>
+        <w:rPr>
+          <w:lang w:val="es-MX"/>
+        </w:rPr>
+        <w:t>enerar pieza</w:t>
+      </w:r>
+      <w:r>
+        <w:rPr>
+          <w:lang w:val="es-MX"/>
+        </w:rPr>
+        <w:t>s aleatoriamente.</w:t>
+      </w:r>
+    </w:p>
+    <w:p>
+      <w:pPr>
+        <w:pStyle w:val="Prrafodelista"/>
+        <w:numPr>
+          <w:ilvl w:val="0"/>
+          <w:numId w:val="2"/>
+        </w:numPr>
+        <w:rPr>
+          <w:lang w:val="es-MX"/>
+        </w:rPr>
+      </w:pPr>
+      <w:r>
+        <w:rPr>
+          <w:lang w:val="es-MX"/>
+        </w:rPr>
+        <w:t>M</w:t>
+      </w:r>
+      <w:r>
+        <w:rPr>
+          <w:lang w:val="es-MX"/>
+        </w:rPr>
+        <w:t>ostrar tablero</w:t>
+      </w:r>
+      <w:r>
+        <w:rPr>
+          <w:lang w:val="es-MX"/>
+        </w:rPr>
+        <w:t>.</w:t>
+      </w:r>
+    </w:p>
+    <w:p>
+      <w:pPr>
+        <w:pStyle w:val="Prrafodelista"/>
+        <w:numPr>
+          <w:ilvl w:val="0"/>
+          <w:numId w:val="2"/>
+        </w:numPr>
+        <w:rPr>
+          <w:lang w:val="es-MX"/>
+        </w:rPr>
+      </w:pPr>
+      <w:r>
+        <w:rPr>
+          <w:lang w:val="es-MX"/>
+        </w:rPr>
+        <w:t>U</w:t>
+      </w:r>
+      <w:r>
+        <w:rPr>
+          <w:lang w:val="es-MX"/>
+        </w:rPr>
+        <w:t>suario elige acción</w:t>
+      </w:r>
+      <w:r>
+        <w:rPr>
+          <w:lang w:val="es-MX"/>
+        </w:rPr>
+        <w:t xml:space="preserve"> (movimiento de la ficha).</w:t>
+      </w:r>
+    </w:p>
+    <w:p>
+      <w:pPr>
+        <w:pStyle w:val="Prrafodelista"/>
+        <w:numPr>
+          <w:ilvl w:val="0"/>
+          <w:numId w:val="2"/>
+        </w:numPr>
+        <w:rPr>
+          <w:lang w:val="es-MX"/>
+        </w:rPr>
+      </w:pPr>
+      <w:r>
+        <w:rPr>
+          <w:lang w:val="es-MX"/>
+        </w:rPr>
+        <w:t>A</w:t>
+      </w:r>
+      <w:r>
+        <w:rPr>
+          <w:lang w:val="es-MX"/>
+        </w:rPr>
+        <w:t>ctualizar tablero</w:t>
+      </w:r>
+      <w:r>
+        <w:rPr>
+          <w:lang w:val="es-MX"/>
+        </w:rPr>
+        <w:t xml:space="preserve"> con la acción del usuario</w:t>
+      </w:r>
+    </w:p>
+    <w:p>
+      <w:pPr>
+        <w:pStyle w:val="Prrafodelista"/>
+        <w:numPr>
+          <w:ilvl w:val="0"/>
+          <w:numId w:val="2"/>
+        </w:numPr>
+        <w:rPr>
+          <w:lang w:val="es-MX"/>
+        </w:rPr>
+      </w:pPr>
+      <w:r>
+        <w:rPr>
+          <w:lang w:val="es-MX"/>
+        </w:rPr>
+        <w:t>V</w:t>
+      </w:r>
+      <w:r>
+        <w:rPr>
+          <w:lang w:val="es-MX"/>
+        </w:rPr>
+        <w:t>erificar colisiones</w:t>
+      </w:r>
+      <w:r>
+        <w:rPr>
+          <w:lang w:val="es-MX"/>
+        </w:rPr>
+        <w:t>, para saber si la ficha se mueve o se detiene.</w:t>
+      </w:r>
+    </w:p>
+    <w:p>
+      <w:pPr>
+        <w:pStyle w:val="Prrafodelista"/>
+        <w:numPr>
+          <w:ilvl w:val="0"/>
+          <w:numId w:val="2"/>
+        </w:numPr>
+        <w:rPr>
+          <w:lang w:val="es-MX"/>
+        </w:rPr>
+      </w:pPr>
+      <w:r>
+        <w:rPr>
+          <w:lang w:val="es-MX"/>
+        </w:rPr>
+        <w:t>V</w:t>
+      </w:r>
+      <w:r>
+        <w:rPr>
+          <w:lang w:val="es-MX"/>
+        </w:rPr>
+        <w:t>erificar filas completas</w:t>
+      </w:r>
+      <w:r>
+        <w:rPr>
+          <w:lang w:val="es-MX"/>
+        </w:rPr>
+        <w:t>.</w:t>
+      </w:r>
+    </w:p>
+    <w:p>
+      <w:pPr>
+        <w:pStyle w:val="Prrafodelista"/>
+        <w:numPr>
+          <w:ilvl w:val="0"/>
+          <w:numId w:val="2"/>
+        </w:numPr>
+        <w:rPr>
+          <w:lang w:val="es-MX"/>
+        </w:rPr>
+      </w:pPr>
+      <w:r>
+        <w:rPr>
+          <w:lang w:val="es-MX"/>
+        </w:rPr>
+        <w:t>Verificar si no caben más ficha en la parte superior del tablero</w:t>
+      </w:r>
+    </w:p>
+    <w:p>
+      <w:pPr>
+        <w:pStyle w:val="Prrafodelista"/>
+        <w:numPr>
+          <w:ilvl w:val="0"/>
+          <w:numId w:val="2"/>
+        </w:numPr>
+        <w:rPr>
+          <w:lang w:val="es-MX"/>
+        </w:rPr>
+      </w:pPr>
+      <w:r>
+        <w:rPr>
+          <w:lang w:val="es-MX"/>
+        </w:rPr>
+        <w:t>Si caben más fichas puede seguir jugando</w:t>
+      </w:r>
+    </w:p>
+    <w:p>
+      <w:pPr>
+        <w:pStyle w:val="Prrafodelista"/>
+        <w:numPr>
+          <w:ilvl w:val="0"/>
+          <w:numId w:val="2"/>
+        </w:numPr>
+        <w:rPr>
+          <w:lang w:val="es-MX"/>
+        </w:rPr>
+      </w:pPr>
+      <w:r>
+        <w:rPr>
+          <w:lang w:val="es-MX"/>
+        </w:rPr>
+        <w:t>Sino se pierde el juego y vuelve a iniciar si el usuario lo desea</w:t>
+      </w:r>
     </w:p>
     <w:sectPr>
       <w:pgSz w:w="12240" w:h="15840"/>
@@ -4241,6 +4446,95 @@
 <file path=word/numbering.xml><?xml version="1.0" encoding="utf-8"?>
 <w:numbering xmlns:wpc="http://schemas.microsoft.com/office/word/2010/wordprocessingCanvas" xmlns:cx="http://schemas.microsoft.com/office/drawing/2014/chartex" xmlns:cx1="http://schemas.microsoft.com/office/drawing/2015/9/8/chartex" xmlns:cx2="http://schemas.microsoft.com/office/drawing/2015/10/21/chartex" xmlns:cx3="http://schemas.microsoft.com/office/drawing/2016/5/9/chartex" xmlns:cx4="http://schemas.microsoft.com/office/drawing/2016/5/10/chartex" xmlns:cx5="http://schemas.microsoft.com/office/drawing/2016/5/11/chartex" xmlns:cx6="http://schemas.microsoft.com/office/drawing/2016/5/12/chartex" xmlns:cx7="http://schemas.microsoft.com/office/drawing/2016/5/13/chartex" xmlns:cx8="http://schemas.microsoft.com/office/drawing/2016/5/14/chartex" xmlns:mc="http://schemas.openxmlformats.org/markup-compatibility/2006" xmlns:aink="http://schemas.microsoft.com/office/drawing/2016/ink" xmlns:am3d="http://schemas.microsoft.com/office/drawing/2017/model3d" xmlns:o="urn:schemas-microsoft-com:office:office" xmlns:oel="http://schemas.microsoft.com/office/2019/extlst" xmlns:r="http://schemas.openxmlformats.org/officeDocument/2006/relationships" xmlns:m="http://schemas.openxmlformats.org/officeDocument/2006/math" xmlns:v="urn:schemas-microsoft-com:vml" xmlns:wp14="http://schemas.microsoft.com/office/word/2010/wordprocessingDrawing" xmlns:wp="http://schemas.openxmlformats.org/drawingml/2006/wordprocessingDrawing" xmlns:w10="urn:schemas-microsoft-com:office:word" xmlns:w="http://schemas.openxmlformats.org/wordprocessingml/2006/main" xmlns:w14="http://schemas.microsoft.com/office/word/2010/wordml" xmlns:w15="http://schemas.microsoft.com/office/word/2012/wordml" xmlns:w16cex="http://schemas.microsoft.com/office/word/2018/wordml/cex" xmlns:w16cid="http://schemas.microsoft.com/office/word/2016/wordml/cid" xmlns:w16="http://schemas.microsoft.com/office/word/2018/wordml" xmlns:w16du="http://schemas.microsoft.com/office/word/2023/wordml/word16du" xmlns:w16sdtdh="http://schemas.microsoft.com/office/word/2020/wordml/sdtdatahash" xmlns:w16sdtfl="http://schemas.microsoft.com/office/word/2024/wordml/sdtformatlock" xmlns:w16se="http://schemas.microsoft.com/office/word/2015/wordml/symex" xmlns:wpg="http://schemas.microsoft.com/office/word/2010/wordprocessingGroup" xmlns:wpi="http://schemas.microsoft.com/office/word/2010/wordprocessingInk" xmlns:wne="http://schemas.microsoft.com/office/word/2006/wordml" xmlns:wps="http://schemas.microsoft.com/office/word/2010/wordprocessingShape" mc:Ignorable="w14 w15 w16se w16cid w16 w16cex w16sdtdh w16sdtfl w16du wp14">
   <w:abstractNum w:abstractNumId="0" w15:restartNumberingAfterBreak="0">
+    <w:nsid w:val="07E8707D"/>
+    <w:multiLevelType w:val="hybridMultilevel"/>
+    <w:tmpl w:val="FA8EC3E6"/>
+    <w:lvl w:ilvl="0" w:tplc="240A000F">
+      <w:start w:val="1"/>
+      <w:numFmt w:val="decimal"/>
+      <w:lvlText w:val="%1."/>
+      <w:lvlJc w:val="left"/>
+      <w:pPr>
+        <w:ind w:left="720" w:hanging="360"/>
+      </w:pPr>
+      <w:rPr>
+        <w:rFonts w:hint="default"/>
+      </w:rPr>
+    </w:lvl>
+    <w:lvl w:ilvl="1" w:tplc="240A0019" w:tentative="1">
+      <w:start w:val="1"/>
+      <w:numFmt w:val="lowerLetter"/>
+      <w:lvlText w:val="%2."/>
+      <w:lvlJc w:val="left"/>
+      <w:pPr>
+        <w:ind w:left="1440" w:hanging="360"/>
+      </w:pPr>
+    </w:lvl>
+    <w:lvl w:ilvl="2" w:tplc="240A001B" w:tentative="1">
+      <w:start w:val="1"/>
+      <w:numFmt w:val="lowerRoman"/>
+      <w:lvlText w:val="%3."/>
+      <w:lvlJc w:val="right"/>
+      <w:pPr>
+        <w:ind w:left="2160" w:hanging="180"/>
+      </w:pPr>
+    </w:lvl>
+    <w:lvl w:ilvl="3" w:tplc="240A000F" w:tentative="1">
+      <w:start w:val="1"/>
+      <w:numFmt w:val="decimal"/>
+      <w:lvlText w:val="%4."/>
+      <w:lvlJc w:val="left"/>
+      <w:pPr>
+        <w:ind w:left="2880" w:hanging="360"/>
+      </w:pPr>
+    </w:lvl>
+    <w:lvl w:ilvl="4" w:tplc="240A0019" w:tentative="1">
+      <w:start w:val="1"/>
+      <w:numFmt w:val="lowerLetter"/>
+      <w:lvlText w:val="%5."/>
+      <w:lvlJc w:val="left"/>
+      <w:pPr>
+        <w:ind w:left="3600" w:hanging="360"/>
+      </w:pPr>
+    </w:lvl>
+    <w:lvl w:ilvl="5" w:tplc="240A001B" w:tentative="1">
+      <w:start w:val="1"/>
+      <w:numFmt w:val="lowerRoman"/>
+      <w:lvlText w:val="%6."/>
+      <w:lvlJc w:val="right"/>
+      <w:pPr>
+        <w:ind w:left="4320" w:hanging="180"/>
+      </w:pPr>
+    </w:lvl>
+    <w:lvl w:ilvl="6" w:tplc="240A000F" w:tentative="1">
+      <w:start w:val="1"/>
+      <w:numFmt w:val="decimal"/>
+      <w:lvlText w:val="%7."/>
+      <w:lvlJc w:val="left"/>
+      <w:pPr>
+        <w:ind w:left="5040" w:hanging="360"/>
+      </w:pPr>
+    </w:lvl>
+    <w:lvl w:ilvl="7" w:tplc="240A0019" w:tentative="1">
+      <w:start w:val="1"/>
+      <w:numFmt w:val="lowerLetter"/>
+      <w:lvlText w:val="%8."/>
+      <w:lvlJc w:val="left"/>
+      <w:pPr>
+        <w:ind w:left="5760" w:hanging="360"/>
+      </w:pPr>
+    </w:lvl>
+    <w:lvl w:ilvl="8" w:tplc="240A001B" w:tentative="1">
+      <w:start w:val="1"/>
+      <w:numFmt w:val="lowerRoman"/>
+      <w:lvlText w:val="%9."/>
+      <w:lvlJc w:val="right"/>
+      <w:pPr>
+        <w:ind w:left="6480" w:hanging="180"/>
+      </w:pPr>
+    </w:lvl>
+  </w:abstractNum>
+  <w:abstractNum w:abstractNumId="1" w15:restartNumberingAfterBreak="0">
     <w:nsid w:val="59C524BF"/>
     <w:multiLevelType w:val="hybridMultilevel"/>
     <w:tmpl w:val="46BE34F8"/>
@@ -4353,6 +4647,9 @@
     </w:lvl>
   </w:abstractNum>
   <w:num w:numId="1" w16cid:durableId="129369529">
+    <w:abstractNumId w:val="1"/>
+  </w:num>
+  <w:num w:numId="2" w16cid:durableId="490871769">
     <w:abstractNumId w:val="0"/>
   </w:num>
 </w:numbering>

</xml_diff>

<commit_message>
Entrega final de la primera entrega
</commit_message>
<xml_diff>
--- a/Analisis_Primer_Desafio.docx
+++ b/Analisis_Primer_Desafio.docx
@@ -4433,6 +4433,201 @@
         <w:t>Sino se pierde el juego y vuelve a iniciar si el usuario lo desea</w:t>
       </w:r>
     </w:p>
+    <w:p>
+      <w:pPr>
+        <w:rPr>
+          <w:u w:val="single"/>
+          <w:lang w:val="es-MX"/>
+        </w:rPr>
+      </w:pPr>
+      <w:r>
+        <w:rPr>
+          <w:u w:val="single"/>
+          <w:lang w:val="es-MX"/>
+        </w:rPr>
+        <w:t>ESQUEMA DE TAREAS PARA CUMPLIR CON EL DESAFÍO:</w:t>
+      </w:r>
+    </w:p>
+    <w:p>
+      <w:pPr>
+        <w:pStyle w:val="Prrafodelista"/>
+        <w:numPr>
+          <w:ilvl w:val="0"/>
+          <w:numId w:val="3"/>
+        </w:numPr>
+        <w:rPr>
+          <w:lang w:val="es-MX"/>
+        </w:rPr>
+      </w:pPr>
+      <w:r>
+        <w:rPr>
+          <w:lang w:val="es-MX"/>
+        </w:rPr>
+        <w:t>Hacer el análisis inicial del desafío (Este documento) = 13 de marzo</w:t>
+      </w:r>
+    </w:p>
+    <w:p>
+      <w:pPr>
+        <w:pStyle w:val="Prrafodelista"/>
+        <w:numPr>
+          <w:ilvl w:val="0"/>
+          <w:numId w:val="3"/>
+        </w:numPr>
+        <w:rPr>
+          <w:lang w:val="es-MX"/>
+        </w:rPr>
+      </w:pPr>
+      <w:r>
+        <w:rPr>
+          <w:lang w:val="es-MX"/>
+        </w:rPr>
+        <w:t>Creación del proyecto el QT = 14 de marzo</w:t>
+      </w:r>
+    </w:p>
+    <w:p>
+      <w:pPr>
+        <w:pStyle w:val="Prrafodelista"/>
+        <w:numPr>
+          <w:ilvl w:val="0"/>
+          <w:numId w:val="3"/>
+        </w:numPr>
+        <w:rPr>
+          <w:lang w:val="es-MX"/>
+        </w:rPr>
+      </w:pPr>
+      <w:r>
+        <w:rPr>
+          <w:lang w:val="es-MX"/>
+        </w:rPr>
+        <w:t>Iniciar con la implementación del tablero = 14 de marzo</w:t>
+      </w:r>
+    </w:p>
+    <w:p>
+      <w:pPr>
+        <w:pStyle w:val="Prrafodelista"/>
+        <w:numPr>
+          <w:ilvl w:val="0"/>
+          <w:numId w:val="3"/>
+        </w:numPr>
+        <w:rPr>
+          <w:lang w:val="es-MX"/>
+        </w:rPr>
+      </w:pPr>
+      <w:r>
+        <w:rPr>
+          <w:lang w:val="es-MX"/>
+        </w:rPr>
+        <w:t>Implementar la función para generar las piezas aleatoriamente = 14 de marzo</w:t>
+      </w:r>
+    </w:p>
+    <w:p>
+      <w:pPr>
+        <w:pStyle w:val="Prrafodelista"/>
+        <w:numPr>
+          <w:ilvl w:val="0"/>
+          <w:numId w:val="3"/>
+        </w:numPr>
+        <w:rPr>
+          <w:lang w:val="es-MX"/>
+        </w:rPr>
+      </w:pPr>
+      <w:r>
+        <w:rPr>
+          <w:lang w:val="es-MX"/>
+        </w:rPr>
+        <w:t>Implementar operaciones de bits para movimientos = 15 de marzo</w:t>
+      </w:r>
+    </w:p>
+    <w:p>
+      <w:pPr>
+        <w:pStyle w:val="Prrafodelista"/>
+        <w:numPr>
+          <w:ilvl w:val="0"/>
+          <w:numId w:val="3"/>
+        </w:numPr>
+        <w:rPr>
+          <w:lang w:val="es-MX"/>
+        </w:rPr>
+      </w:pPr>
+      <w:r>
+        <w:rPr>
+          <w:lang w:val="es-MX"/>
+        </w:rPr>
+        <w:t>Iniciar con la función para detectar colisiones =15 marzo</w:t>
+      </w:r>
+    </w:p>
+    <w:p>
+      <w:pPr>
+        <w:pStyle w:val="Prrafodelista"/>
+        <w:numPr>
+          <w:ilvl w:val="0"/>
+          <w:numId w:val="3"/>
+        </w:numPr>
+        <w:rPr>
+          <w:lang w:val="es-MX"/>
+        </w:rPr>
+      </w:pPr>
+      <w:r>
+        <w:rPr>
+          <w:lang w:val="es-MX"/>
+        </w:rPr>
+        <w:t>Implementar función para comprobar filas completas = 16 de marzo</w:t>
+      </w:r>
+    </w:p>
+    <w:p>
+      <w:pPr>
+        <w:pStyle w:val="Prrafodelista"/>
+        <w:numPr>
+          <w:ilvl w:val="0"/>
+          <w:numId w:val="3"/>
+        </w:numPr>
+        <w:rPr>
+          <w:lang w:val="es-MX"/>
+        </w:rPr>
+      </w:pPr>
+      <w:r>
+        <w:rPr>
+          <w:lang w:val="es-MX"/>
+        </w:rPr>
+        <w:t>Integración del juego en el main = 17 de marzo</w:t>
+      </w:r>
+    </w:p>
+    <w:p>
+      <w:pPr>
+        <w:pStyle w:val="Prrafodelista"/>
+        <w:numPr>
+          <w:ilvl w:val="0"/>
+          <w:numId w:val="3"/>
+        </w:numPr>
+        <w:rPr>
+          <w:lang w:val="es-MX"/>
+        </w:rPr>
+      </w:pPr>
+      <w:r>
+        <w:rPr>
+          <w:lang w:val="es-MX"/>
+        </w:rPr>
+        <w:t>Ajustes de detalles finales y pruebas = 18 y 19 de marzo</w:t>
+      </w:r>
+    </w:p>
+    <w:p>
+      <w:pPr>
+        <w:pStyle w:val="Prrafodelista"/>
+        <w:numPr>
+          <w:ilvl w:val="0"/>
+          <w:numId w:val="3"/>
+        </w:numPr>
+        <w:rPr>
+          <w:lang w:val="es-MX"/>
+        </w:rPr>
+      </w:pPr>
+      <w:r>
+        <w:rPr>
+          <w:lang w:val="es-MX"/>
+        </w:rPr>
+        <w:t xml:space="preserve">Entrega final = 20 de marzo </w:t>
+      </w:r>
+    </w:p>
     <w:sectPr>
       <w:pgSz w:w="12240" w:h="15840"/>
       <w:pgMar w:top="1417" w:right="1701" w:bottom="1417" w:left="1701" w:header="708" w:footer="708" w:gutter="0"/>
@@ -4646,11 +4841,103 @@
       </w:rPr>
     </w:lvl>
   </w:abstractNum>
+  <w:abstractNum w:abstractNumId="2" w15:restartNumberingAfterBreak="0">
+    <w:nsid w:val="6E6977DD"/>
+    <w:multiLevelType w:val="hybridMultilevel"/>
+    <w:tmpl w:val="60C02EC2"/>
+    <w:lvl w:ilvl="0" w:tplc="240A000F">
+      <w:start w:val="1"/>
+      <w:numFmt w:val="decimal"/>
+      <w:lvlText w:val="%1."/>
+      <w:lvlJc w:val="left"/>
+      <w:pPr>
+        <w:ind w:left="720" w:hanging="360"/>
+      </w:pPr>
+      <w:rPr>
+        <w:rFonts w:hint="default"/>
+      </w:rPr>
+    </w:lvl>
+    <w:lvl w:ilvl="1" w:tplc="240A0019" w:tentative="1">
+      <w:start w:val="1"/>
+      <w:numFmt w:val="lowerLetter"/>
+      <w:lvlText w:val="%2."/>
+      <w:lvlJc w:val="left"/>
+      <w:pPr>
+        <w:ind w:left="1440" w:hanging="360"/>
+      </w:pPr>
+    </w:lvl>
+    <w:lvl w:ilvl="2" w:tplc="240A001B" w:tentative="1">
+      <w:start w:val="1"/>
+      <w:numFmt w:val="lowerRoman"/>
+      <w:lvlText w:val="%3."/>
+      <w:lvlJc w:val="right"/>
+      <w:pPr>
+        <w:ind w:left="2160" w:hanging="180"/>
+      </w:pPr>
+    </w:lvl>
+    <w:lvl w:ilvl="3" w:tplc="240A000F" w:tentative="1">
+      <w:start w:val="1"/>
+      <w:numFmt w:val="decimal"/>
+      <w:lvlText w:val="%4."/>
+      <w:lvlJc w:val="left"/>
+      <w:pPr>
+        <w:ind w:left="2880" w:hanging="360"/>
+      </w:pPr>
+    </w:lvl>
+    <w:lvl w:ilvl="4" w:tplc="240A0019" w:tentative="1">
+      <w:start w:val="1"/>
+      <w:numFmt w:val="lowerLetter"/>
+      <w:lvlText w:val="%5."/>
+      <w:lvlJc w:val="left"/>
+      <w:pPr>
+        <w:ind w:left="3600" w:hanging="360"/>
+      </w:pPr>
+    </w:lvl>
+    <w:lvl w:ilvl="5" w:tplc="240A001B" w:tentative="1">
+      <w:start w:val="1"/>
+      <w:numFmt w:val="lowerRoman"/>
+      <w:lvlText w:val="%6."/>
+      <w:lvlJc w:val="right"/>
+      <w:pPr>
+        <w:ind w:left="4320" w:hanging="180"/>
+      </w:pPr>
+    </w:lvl>
+    <w:lvl w:ilvl="6" w:tplc="240A000F" w:tentative="1">
+      <w:start w:val="1"/>
+      <w:numFmt w:val="decimal"/>
+      <w:lvlText w:val="%7."/>
+      <w:lvlJc w:val="left"/>
+      <w:pPr>
+        <w:ind w:left="5040" w:hanging="360"/>
+      </w:pPr>
+    </w:lvl>
+    <w:lvl w:ilvl="7" w:tplc="240A0019" w:tentative="1">
+      <w:start w:val="1"/>
+      <w:numFmt w:val="lowerLetter"/>
+      <w:lvlText w:val="%8."/>
+      <w:lvlJc w:val="left"/>
+      <w:pPr>
+        <w:ind w:left="5760" w:hanging="360"/>
+      </w:pPr>
+    </w:lvl>
+    <w:lvl w:ilvl="8" w:tplc="240A001B" w:tentative="1">
+      <w:start w:val="1"/>
+      <w:numFmt w:val="lowerRoman"/>
+      <w:lvlText w:val="%9."/>
+      <w:lvlJc w:val="right"/>
+      <w:pPr>
+        <w:ind w:left="6480" w:hanging="180"/>
+      </w:pPr>
+    </w:lvl>
+  </w:abstractNum>
   <w:num w:numId="1" w16cid:durableId="129369529">
     <w:abstractNumId w:val="1"/>
   </w:num>
   <w:num w:numId="2" w16cid:durableId="490871769">
     <w:abstractNumId w:val="0"/>
+  </w:num>
+  <w:num w:numId="3" w16cid:durableId="2022272845">
+    <w:abstractNumId w:val="2"/>
   </w:num>
 </w:numbering>
 </file>

</xml_diff>